<commit_message>
[Nairne] Add Nikki ($223 in Nov) to 1099 contractors
Per Nairne 2026-05-05: only Nikki approved from the 7-person delta list.
All others (Raj, Phil, Alec, Jake, Issac, Luke) remain at their original
Distributions ledger values. Doug Corpuz, Armada Prime Tech retained,
TruQuant, and Raj (Split) entries from the Updated file are NOT added.

Changes:
  - ACTUAL_PAID["2025-11"]["Nikki"] = 223.00
  - Added Nikki to P&L Direct Costs line and 1099 Recipients tab
  - Updated cover memo

Updated headline numbers:
  Revenue:          $153,023.03 (unchanged)
  1099 Contractors: $86,754.81  (was $86,531.81; +$223 Nikki)
  Op Expenses:      $91,225.00  (unchanged)
  Net Income GAAP:  $-24,956.78 (was $-24,733.78; -$223 Nikki)
  Net Income Reclass: $14,818.22 (was $15,041.22; -$223 Nikki)

Co-Authored-By: Claude Opus 4.7 (1M context) <noreply@anthropic.com>
</commit_message>
<xml_diff>
--- a/monily-package/05_Cover_Memo_for_Monily.docx
+++ b/monily-package/05_Cover_Memo_for_Monily.docx
@@ -416,7 +416,7 @@
           <w:p>
             <w:r/>
             <w:r>
-              <w:t>($86,531.81)</w:t>
+              <w:t>($86,754.81)</w:t>
             </w:r>
           </w:p>
         </w:tc>
@@ -428,7 +428,7 @@
           <w:p>
             <w:r/>
             <w:r>
-              <w:t>($86,531.81)</w:t>
+              <w:t>($86,754.81)</w:t>
             </w:r>
           </w:p>
         </w:tc>
@@ -498,7 +498,7 @@
               <w:rPr>
                 <w:b/>
               </w:rPr>
-              <w:t>$-24,733.78</w:t>
+              <w:t>$-24,956.78</w:t>
             </w:r>
           </w:p>
         </w:tc>
@@ -513,7 +513,7 @@
               <w:rPr>
                 <w:b/>
               </w:rPr>
-              <w:t>$15,041.22</w:t>
+              <w:t>$14,818.22</w:t>
             </w:r>
           </w:p>
         </w:tc>
@@ -727,7 +727,7 @@
           <w:p>
             <w:r/>
             <w:r>
-              <w:t>$14,794.64</w:t>
+              <w:t>$14,575.30</w:t>
             </w:r>
           </w:p>
         </w:tc>
@@ -780,7 +780,7 @@
           <w:p>
             <w:r/>
             <w:r>
-              <w:t>$123.29</w:t>
+              <w:t>$121.46</w:t>
             </w:r>
           </w:p>
         </w:tc>
@@ -833,7 +833,7 @@
           <w:p>
             <w:r/>
             <w:r>
-              <w:t>$123.29</w:t>
+              <w:t>$121.46</w:t>
             </w:r>
           </w:p>
         </w:tc>
@@ -1060,6 +1060,32 @@
           <w:p>
             <w:r/>
             <w:r>
+              <w:t>Nikki</w:t>
+            </w:r>
+          </w:p>
+        </w:tc>
+        <w:tc>
+          <w:tcPr>
+            <w:tcW w:type="dxa" w:w="5040"/>
+            <w:vAlign w:val="center"/>
+          </w:tcPr>
+          <w:p>
+            <w:r/>
+            <w:r>
+              <w:t>$223.00</w:t>
+            </w:r>
+          </w:p>
+        </w:tc>
+      </w:tr>
+      <w:tr>
+        <w:tc>
+          <w:tcPr>
+            <w:tcW w:type="dxa" w:w="5040"/>
+            <w:vAlign w:val="center"/>
+          </w:tcPr>
+          <w:p>
+            <w:r/>
+            <w:r>
               <w:t>Chris (operating contractor)</w:t>
             </w:r>
           </w:p>
@@ -1104,7 +1130,7 @@
               <w:rPr>
                 <w:b/>
               </w:rPr>
-              <w:t>$98,031.81</w:t>
+              <w:t>$98,254.81</w:t>
             </w:r>
           </w:p>
         </w:tc>

</xml_diff>